<commit_message>
Additional changes for Release Notes for 3.25.0
</commit_message>
<xml_diff>
--- a/doc/release/HPC DME Release Notes 3.25.0.docx
+++ b/doc/release/HPC DME Release Notes 3.25.0.docx
@@ -2835,10 +2835,10 @@
               </w:rPr>
             </w:pPr>
             <w:bookmarkStart w:id="5" w:name="OLE_LINK75"/>
-            <w:bookmarkStart w:id="6" w:name="OLE_LINK16"/>
-            <w:bookmarkStart w:id="7" w:name="OLE_LINK7"/>
-            <w:bookmarkStart w:id="8" w:name="OLE_LINK8"/>
-            <w:bookmarkStart w:id="9" w:name="OLE_LINK99"/>
+            <w:bookmarkStart w:id="6" w:name="OLE_LINK99"/>
+            <w:bookmarkStart w:id="7" w:name="OLE_LINK16"/>
+            <w:bookmarkStart w:id="8" w:name="OLE_LINK7"/>
+            <w:bookmarkStart w:id="9" w:name="OLE_LINK8"/>
             <w:r>
               <w:rPr>
                 <w:rFonts w:ascii="Aptos" w:hAnsi="Aptos" w:cstheme="minorHAnsi"/>
@@ -3123,7 +3123,31 @@
                 <w:color w:val="000000" w:themeColor="text1"/>
                 <w:u w:val="single"/>
               </w:rPr>
-              <w:t>HPCDATAMGM-1946, 2166:</w:t>
+              <w:t>DMESUPPORT</w:t>
+            </w:r>
+            <w:r>
+              <w:rPr>
+                <w:rFonts w:ascii="Aptos" w:hAnsi="Aptos" w:cs="Segoe UI"/>
+                <w:color w:val="000000" w:themeColor="text1"/>
+                <w:u w:val="single"/>
+              </w:rPr>
+              <w:t>-19</w:t>
+            </w:r>
+            <w:r>
+              <w:rPr>
+                <w:rFonts w:ascii="Aptos" w:hAnsi="Aptos" w:cs="Segoe UI"/>
+                <w:color w:val="000000" w:themeColor="text1"/>
+                <w:u w:val="single"/>
+              </w:rPr>
+              <w:t>1</w:t>
+            </w:r>
+            <w:r>
+              <w:rPr>
+                <w:rFonts w:ascii="Aptos" w:hAnsi="Aptos" w:cs="Segoe UI"/>
+                <w:color w:val="000000" w:themeColor="text1"/>
+                <w:u w:val="single"/>
+              </w:rPr>
+              <w:t>:</w:t>
             </w:r>
             <w:r>
               <w:rPr>
@@ -3139,23 +3163,7 @@
                 <w:color w:val="000000" w:themeColor="text1"/>
                 <w:shd w:val="clear" w:color="auto" w:fill="FFFFFF"/>
               </w:rPr>
-              <w:t>Fix</w:t>
-            </w:r>
-            <w:r>
-              <w:rPr>
-                <w:rFonts w:ascii="Aptos" w:hAnsi="Aptos" w:cs="Segoe UI"/>
-                <w:color w:val="000000" w:themeColor="text1"/>
-                <w:shd w:val="clear" w:color="auto" w:fill="FFFFFF"/>
-              </w:rPr>
-              <w:t>ed</w:t>
-            </w:r>
-            <w:r>
-              <w:rPr>
-                <w:rFonts w:ascii="Aptos" w:hAnsi="Aptos" w:cs="Segoe UI"/>
-                <w:color w:val="000000" w:themeColor="text1"/>
-                <w:shd w:val="clear" w:color="auto" w:fill="FFFFFF"/>
-              </w:rPr>
-              <w:t xml:space="preserve"> the issue with incorrect tar contents count computation by the DME archival workflow during tarring of directories that have sub-directories</w:t>
+              <w:t>Fixed the issue with incorrect tar contents count computation by the DME archival workflow during tarring of directories that have sub-directories</w:t>
             </w:r>
             <w:bookmarkEnd w:id="27"/>
             <w:r>
@@ -3326,19 +3334,7 @@
               <w:rPr>
                 <w:rFonts w:ascii="Aptos" w:hAnsi="Aptos" w:cstheme="minorHAnsi"/>
               </w:rPr>
-              <w:t xml:space="preserve"> the DME Registration APIs to enable system administrators to update system metadata. This is to facilitate maintenance activities </w:t>
-            </w:r>
-            <w:r>
-              <w:rPr>
-                <w:rFonts w:ascii="Aptos" w:hAnsi="Aptos" w:cstheme="minorHAnsi"/>
-              </w:rPr>
-              <w:t xml:space="preserve">for users </w:t>
-            </w:r>
-            <w:r>
-              <w:rPr>
-                <w:rFonts w:ascii="Aptos" w:hAnsi="Aptos" w:cstheme="minorHAnsi"/>
-              </w:rPr>
-              <w:t>on existing datasets.</w:t>
+              <w:t xml:space="preserve"> the DME Registration APIs to enable system administrators to update system metadata. This is to facilitate maintenance activities for users on existing datasets.</w:t>
             </w:r>
           </w:p>
           <w:p>
@@ -3569,27 +3565,11 @@
                 <w:color w:val="000000" w:themeColor="text1"/>
                 <w:shd w:val="clear" w:color="auto" w:fill="FFFFFF"/>
               </w:rPr>
-              <w:t>Upgrade</w:t>
-            </w:r>
-            <w:r>
-              <w:rPr>
-                <w:rFonts w:ascii="Aptos" w:hAnsi="Aptos" w:cs="Segoe UI"/>
-                <w:color w:val="000000" w:themeColor="text1"/>
-                <w:shd w:val="clear" w:color="auto" w:fill="FFFFFF"/>
-              </w:rPr>
-              <w:t>d</w:t>
-            </w:r>
-            <w:r>
-              <w:rPr>
-                <w:rFonts w:ascii="Aptos" w:hAnsi="Aptos" w:cs="Segoe UI"/>
-                <w:color w:val="000000" w:themeColor="text1"/>
-                <w:shd w:val="clear" w:color="auto" w:fill="FFFFFF"/>
-              </w:rPr>
-              <w:t xml:space="preserve"> the Spring framework and Apache open-source libraries used in DME that have been flagged by Nessus for security vulnerabilities.</w:t>
+              <w:t>Upgraded the Spring framework and Apache open-source libraries used in DME that have been flagged by Nessus for security vulnerabilities.</w:t>
             </w:r>
           </w:p>
           <w:bookmarkEnd w:id="1"/>
-          <w:bookmarkEnd w:id="9"/>
+          <w:bookmarkEnd w:id="6"/>
           <w:bookmarkEnd w:id="23"/>
           <w:bookmarkEnd w:id="33"/>
           <w:bookmarkEnd w:id="34"/>
@@ -3606,7 +3586,7 @@
               </w:rPr>
             </w:pPr>
           </w:p>
-          <w:bookmarkEnd w:id="6"/>
+          <w:bookmarkEnd w:id="7"/>
           <w:p>
             <w:pPr>
               <w:pStyle w:val="Heading1"/>
@@ -3926,8 +3906,8 @@
             </w:r>
             <w:bookmarkEnd w:id="2"/>
             <w:bookmarkEnd w:id="3"/>
-            <w:bookmarkEnd w:id="7"/>
             <w:bookmarkEnd w:id="8"/>
+            <w:bookmarkEnd w:id="9"/>
             <w:bookmarkEnd w:id="36"/>
           </w:p>
           <w:p>

</xml_diff>